<commit_message>
fix: logo dan align data pj di preview
</commit_message>
<xml_diff>
--- a/SistemBeritaAcara.Web/wwwroot/files/templates/BA_Template_Alokasi.docx
+++ b/SistemBeritaAcara.Web/wwwroot/files/templates/BA_Template_Alokasi.docx
@@ -37,9 +37,17 @@
                 <w:noProof/>
               </w:rPr>
               <w:drawing>
-                <wp:inline distT="0" distB="0" distL="0" distR="0" wp14:anchorId="3CBE1705" wp14:editId="0F43DA6D">
-                  <wp:extent cx="977676" cy="287215"/>
+                <wp:anchor distT="0" distB="0" distL="114300" distR="114300" simplePos="0" relativeHeight="251659264" behindDoc="0" locked="0" layoutInCell="1" allowOverlap="1" wp14:anchorId="27E6B33E" wp14:editId="08023568">
+                  <wp:simplePos x="0" y="0"/>
+                  <wp:positionH relativeFrom="column">
+                    <wp:posOffset>-178045</wp:posOffset>
+                  </wp:positionH>
+                  <wp:positionV relativeFrom="paragraph">
+                    <wp:posOffset>-100330</wp:posOffset>
+                  </wp:positionV>
+                  <wp:extent cx="1185756" cy="348343"/>
                   <wp:effectExtent l="0" t="0" r="0" b="0"/>
+                  <wp:wrapNone/>
                   <wp:docPr id="2091714517" name="Picture 1" descr="PT Pertamina Patra Niaga Logo Vector"/>
                   <wp:cNvGraphicFramePr>
                     <a:graphicFrameLocks xmlns:a="http://schemas.openxmlformats.org/drawingml/2006/main" noChangeAspect="1"/>
@@ -54,7 +62,7 @@
                           </pic:cNvPicPr>
                         </pic:nvPicPr>
                         <pic:blipFill rotWithShape="1">
-                          <a:blip r:embed="rId6" cstate="print">
+                          <a:blip r:embed="rId5" cstate="print">
                             <a:extLst>
                               <a:ext uri="{28A0092B-C50C-407E-A947-70E740481C1C}">
                                 <a14:useLocalDpi xmlns:a14="http://schemas.microsoft.com/office/drawing/2010/main" val="0"/>
@@ -69,7 +77,7 @@
                         <pic:spPr bwMode="auto">
                           <a:xfrm>
                             <a:off x="0" y="0"/>
-                            <a:ext cx="1023252" cy="300604"/>
+                            <a:ext cx="1185756" cy="348343"/>
                           </a:xfrm>
                           <a:prstGeom prst="rect">
                             <a:avLst/>
@@ -87,7 +95,13 @@
                       </pic:pic>
                     </a:graphicData>
                   </a:graphic>
-                </wp:inline>
+                  <wp14:sizeRelH relativeFrom="margin">
+                    <wp14:pctWidth>0</wp14:pctWidth>
+                  </wp14:sizeRelH>
+                  <wp14:sizeRelV relativeFrom="margin">
+                    <wp14:pctHeight>0</wp14:pctHeight>
+                  </wp14:sizeRelV>
+                </wp:anchor>
               </w:drawing>
             </w:r>
           </w:p>
@@ -231,9 +245,9 @@
               <w:tblLook w:val="04A0" w:firstRow="1" w:lastRow="0" w:firstColumn="1" w:lastColumn="0" w:noHBand="0" w:noVBand="1"/>
             </w:tblPr>
             <w:tblGrid>
-              <w:gridCol w:w="1473"/>
+              <w:gridCol w:w="1466"/>
               <w:gridCol w:w="272"/>
-              <w:gridCol w:w="2712"/>
+              <w:gridCol w:w="2719"/>
             </w:tblGrid>
             <w:tr>
               <w:tc>
@@ -527,14 +541,14 @@
         <w:tblLook w:val="04A0" w:firstRow="1" w:lastRow="0" w:firstColumn="1" w:lastColumn="0" w:noHBand="0" w:noVBand="1"/>
       </w:tblPr>
       <w:tblGrid>
-        <w:gridCol w:w="2785"/>
+        <w:gridCol w:w="3235"/>
         <w:gridCol w:w="270"/>
-        <w:gridCol w:w="6073"/>
+        <w:gridCol w:w="5623"/>
       </w:tblGrid>
       <w:tr>
         <w:tc>
           <w:tcPr>
-            <w:tcW w:w="2785" w:type="dxa"/>
+            <w:tcW w:w="3235" w:type="dxa"/>
             <w:tcMar>
               <w:top w:w="60" w:type="dxa"/>
               <w:left w:w="80" w:type="dxa"/>
@@ -544,6 +558,7 @@
           </w:tcPr>
           <w:p>
             <w:pPr>
+              <w:ind w:left="274"/>
               <w:rPr>
                 <w:sz w:val="18"/>
                 <w:szCs w:val="18"/>
@@ -601,7 +616,7 @@
         </w:tc>
         <w:tc>
           <w:tcPr>
-            <w:tcW w:w="6073" w:type="dxa"/>
+            <w:tcW w:w="5623" w:type="dxa"/>
             <w:tcMar>
               <w:top w:w="60" w:type="dxa"/>
               <w:left w:w="80" w:type="dxa"/>
@@ -629,7 +644,7 @@
       <w:tr>
         <w:tc>
           <w:tcPr>
-            <w:tcW w:w="2785" w:type="dxa"/>
+            <w:tcW w:w="3235" w:type="dxa"/>
             <w:tcMar>
               <w:top w:w="60" w:type="dxa"/>
               <w:left w:w="80" w:type="dxa"/>
@@ -639,6 +654,7 @@
           </w:tcPr>
           <w:p>
             <w:pPr>
+              <w:ind w:left="274"/>
               <w:rPr>
                 <w:sz w:val="18"/>
                 <w:szCs w:val="18"/>
@@ -682,7 +698,7 @@
         </w:tc>
         <w:tc>
           <w:tcPr>
-            <w:tcW w:w="6073" w:type="dxa"/>
+            <w:tcW w:w="5623" w:type="dxa"/>
             <w:tcMar>
               <w:top w:w="60" w:type="dxa"/>
               <w:left w:w="80" w:type="dxa"/>
@@ -710,7 +726,7 @@
       <w:tr>
         <w:tc>
           <w:tcPr>
-            <w:tcW w:w="2785" w:type="dxa"/>
+            <w:tcW w:w="3235" w:type="dxa"/>
             <w:tcMar>
               <w:top w:w="60" w:type="dxa"/>
               <w:left w:w="80" w:type="dxa"/>
@@ -720,6 +736,7 @@
           </w:tcPr>
           <w:p>
             <w:pPr>
+              <w:ind w:left="274"/>
               <w:rPr>
                 <w:sz w:val="18"/>
                 <w:szCs w:val="18"/>
@@ -763,7 +780,7 @@
         </w:tc>
         <w:tc>
           <w:tcPr>
-            <w:tcW w:w="6073" w:type="dxa"/>
+            <w:tcW w:w="5623" w:type="dxa"/>
             <w:tcMar>
               <w:top w:w="60" w:type="dxa"/>
               <w:left w:w="80" w:type="dxa"/>
@@ -791,7 +808,7 @@
       <w:tr>
         <w:tc>
           <w:tcPr>
-            <w:tcW w:w="2785" w:type="dxa"/>
+            <w:tcW w:w="3235" w:type="dxa"/>
             <w:tcMar>
               <w:top w:w="60" w:type="dxa"/>
               <w:left w:w="80" w:type="dxa"/>
@@ -801,6 +818,7 @@
           </w:tcPr>
           <w:p>
             <w:pPr>
+              <w:ind w:left="274"/>
               <w:rPr>
                 <w:sz w:val="18"/>
                 <w:szCs w:val="18"/>
@@ -858,7 +876,7 @@
         </w:tc>
         <w:tc>
           <w:tcPr>
-            <w:tcW w:w="6073" w:type="dxa"/>
+            <w:tcW w:w="5623" w:type="dxa"/>
             <w:tcMar>
               <w:top w:w="60" w:type="dxa"/>
               <w:left w:w="80" w:type="dxa"/>
@@ -878,7 +896,14 @@
                 <w:sz w:val="18"/>
                 <w:szCs w:val="18"/>
               </w:rPr>
-              <w:t>{{FungsiPJ}}</w:t>
+              <w:t xml:space="preserve">{{FungsiPJ}}</w:t>
+            </w:r>
+            <w:r>
+              <w:rPr>
+                <w:sz w:val="18"/>
+                <w:szCs w:val="18"/>
+              </w:rPr>
+              <w:t/>
             </w:r>
           </w:p>
         </w:tc>
@@ -886,7 +911,7 @@
       <w:tr>
         <w:tc>
           <w:tcPr>
-            <w:tcW w:w="2785" w:type="dxa"/>
+            <w:tcW w:w="3235" w:type="dxa"/>
             <w:tcMar>
               <w:top w:w="60" w:type="dxa"/>
               <w:left w:w="80" w:type="dxa"/>
@@ -896,6 +921,7 @@
           </w:tcPr>
           <w:p>
             <w:pPr>
+              <w:ind w:left="274"/>
               <w:rPr>
                 <w:sz w:val="18"/>
                 <w:szCs w:val="18"/>
@@ -939,7 +965,7 @@
         </w:tc>
         <w:tc>
           <w:tcPr>
-            <w:tcW w:w="6073" w:type="dxa"/>
+            <w:tcW w:w="5623" w:type="dxa"/>
             <w:tcMar>
               <w:top w:w="60" w:type="dxa"/>
               <w:left w:w="80" w:type="dxa"/>
@@ -959,7 +985,14 @@
                 <w:sz w:val="18"/>
                 <w:szCs w:val="18"/>
               </w:rPr>
-              <w:t>{{FungsiPJ}}</w:t>
+              <w:t xml:space="preserve">{{FungsiPJ}}</w:t>
+            </w:r>
+            <w:r>
+              <w:rPr>
+                <w:sz w:val="18"/>
+                <w:szCs w:val="18"/>
+              </w:rPr>
+              <w:t/>
             </w:r>
           </w:p>
         </w:tc>
@@ -967,7 +1000,7 @@
       <w:tr>
         <w:tc>
           <w:tcPr>
-            <w:tcW w:w="2785" w:type="dxa"/>
+            <w:tcW w:w="3235" w:type="dxa"/>
             <w:tcMar>
               <w:top w:w="60" w:type="dxa"/>
               <w:left w:w="80" w:type="dxa"/>
@@ -977,6 +1010,7 @@
           </w:tcPr>
           <w:p>
             <w:pPr>
+              <w:ind w:left="274"/>
               <w:rPr>
                 <w:sz w:val="18"/>
                 <w:szCs w:val="18"/>
@@ -1020,7 +1054,7 @@
         </w:tc>
         <w:tc>
           <w:tcPr>
-            <w:tcW w:w="6073" w:type="dxa"/>
+            <w:tcW w:w="5623" w:type="dxa"/>
             <w:tcMar>
               <w:top w:w="60" w:type="dxa"/>
               <w:left w:w="80" w:type="dxa"/>
@@ -1048,7 +1082,7 @@
       <w:tr>
         <w:tc>
           <w:tcPr>
-            <w:tcW w:w="2785" w:type="dxa"/>
+            <w:tcW w:w="3235" w:type="dxa"/>
             <w:tcMar>
               <w:top w:w="60" w:type="dxa"/>
               <w:left w:w="80" w:type="dxa"/>
@@ -1058,6 +1092,7 @@
           </w:tcPr>
           <w:p>
             <w:pPr>
+              <w:ind w:left="274"/>
               <w:rPr>
                 <w:sz w:val="18"/>
                 <w:szCs w:val="18"/>
@@ -1108,7 +1143,7 @@
         </w:tc>
         <w:tc>
           <w:tcPr>
-            <w:tcW w:w="6073" w:type="dxa"/>
+            <w:tcW w:w="5623" w:type="dxa"/>
             <w:tcMar>
               <w:top w:w="60" w:type="dxa"/>
               <w:left w:w="80" w:type="dxa"/>
@@ -1136,7 +1171,7 @@
       <w:tr>
         <w:tc>
           <w:tcPr>
-            <w:tcW w:w="2785" w:type="dxa"/>
+            <w:tcW w:w="3235" w:type="dxa"/>
             <w:tcMar>
               <w:top w:w="60" w:type="dxa"/>
               <w:left w:w="80" w:type="dxa"/>
@@ -1146,6 +1181,7 @@
           </w:tcPr>
           <w:p>
             <w:pPr>
+              <w:ind w:left="274"/>
               <w:rPr>
                 <w:sz w:val="18"/>
                 <w:szCs w:val="18"/>
@@ -1189,7 +1225,7 @@
         </w:tc>
         <w:tc>
           <w:tcPr>
-            <w:tcW w:w="6073" w:type="dxa"/>
+            <w:tcW w:w="5623" w:type="dxa"/>
             <w:tcMar>
               <w:top w:w="60" w:type="dxa"/>
               <w:left w:w="80" w:type="dxa"/>
@@ -1223,12 +1259,14 @@
     <w:p>
       <w:pPr>
         <w:spacing w:line="276" w:lineRule="auto"/>
+        <w:ind w:left="360"/>
         <w:jc w:val="both"/>
         <w:rPr>
           <w:b/>
           <w:bCs/>
           <w:sz w:val="18"/>
           <w:szCs w:val="18"/>
+          <w:lang w:val="nb-NO"/>
         </w:rPr>
       </w:pPr>
       <w:r>
@@ -1237,8 +1275,9 @@
           <w:bCs/>
           <w:sz w:val="18"/>
           <w:szCs w:val="18"/>
-        </w:rPr>
-        <w:t xml:space="preserve">Pada </w:t>
+          <w:lang w:val="nb-NO"/>
+        </w:rPr>
+        <w:t xml:space="preserve">Pada hari ini </w:t>
       </w:r>
       <w:r>
         <w:rPr>
@@ -1246,8 +1285,9 @@
           <w:bCs/>
           <w:sz w:val="18"/>
           <w:szCs w:val="18"/>
-        </w:rPr>
-        <w:t>hari</w:t>
+          <w:lang w:val="nb-NO"/>
+        </w:rPr>
+        <w:t>{{HariTanggal}}</w:t>
       </w:r>
       <w:r>
         <w:rPr>
@@ -1255,6 +1295,27 @@
           <w:bCs/>
           <w:sz w:val="18"/>
           <w:szCs w:val="18"/>
+          <w:lang w:val="nb-NO"/>
+        </w:rPr>
+        <w:t xml:space="preserve"> Tanggal </w:t>
+      </w:r>
+      <w:r>
+        <w:rPr>
+          <w:b/>
+          <w:bCs/>
+          <w:sz w:val="18"/>
+          <w:szCs w:val="18"/>
+          <w:lang w:val="nb-NO"/>
+        </w:rPr>
+        <w:t>{{TanggalAngka}}</w:t>
+      </w:r>
+      <w:r>
+        <w:rPr>
+          <w:b/>
+          <w:bCs/>
+          <w:sz w:val="18"/>
+          <w:szCs w:val="18"/>
+          <w:lang w:val="nb-NO"/>
         </w:rPr>
         <w:t xml:space="preserve"> </w:t>
       </w:r>
@@ -1264,78 +1325,7 @@
           <w:bCs/>
           <w:sz w:val="18"/>
           <w:szCs w:val="18"/>
-        </w:rPr>
-        <w:t>ini</w:t>
-      </w:r>
-      <w:r>
-        <w:rPr>
-          <w:b/>
-          <w:bCs/>
-          <w:sz w:val="18"/>
-          <w:szCs w:val="18"/>
-        </w:rPr>
-        <w:t xml:space="preserve"> </w:t>
-      </w:r>
-      <w:r>
-        <w:rPr>
-          <w:b/>
-          <w:bCs/>
-          <w:sz w:val="18"/>
-          <w:szCs w:val="18"/>
-        </w:rPr>
-        <w:t>{{HariTanggal}}</w:t>
-      </w:r>
-      <w:r>
-        <w:rPr>
-          <w:b/>
-          <w:bCs/>
-          <w:sz w:val="18"/>
-          <w:szCs w:val="18"/>
-        </w:rPr>
-        <w:t xml:space="preserve"> </w:t>
-      </w:r>
-      <w:r>
-        <w:rPr>
-          <w:b/>
-          <w:bCs/>
-          <w:sz w:val="18"/>
-          <w:szCs w:val="18"/>
-        </w:rPr>
-        <w:t>Tanggal</w:t>
-      </w:r>
-      <w:r>
-        <w:rPr>
-          <w:b/>
-          <w:bCs/>
-          <w:sz w:val="18"/>
-          <w:szCs w:val="18"/>
-        </w:rPr>
-        <w:t xml:space="preserve"> </w:t>
-      </w:r>
-      <w:r>
-        <w:rPr>
-          <w:b/>
-          <w:bCs/>
-          <w:sz w:val="18"/>
-          <w:szCs w:val="18"/>
-        </w:rPr>
-        <w:t>{{TanggalAngka}}</w:t>
-      </w:r>
-      <w:r>
-        <w:rPr>
-          <w:b/>
-          <w:bCs/>
-          <w:sz w:val="18"/>
-          <w:szCs w:val="18"/>
-        </w:rPr>
-        <w:t xml:space="preserve"> </w:t>
-      </w:r>
-      <w:r>
-        <w:rPr>
-          <w:b/>
-          <w:bCs/>
-          <w:sz w:val="18"/>
-          <w:szCs w:val="18"/>
+          <w:lang w:val="nb-NO"/>
         </w:rPr>
         <w:t>{{BulanTanggal}}</w:t>
       </w:r>
@@ -1345,188 +1335,9 @@
           <w:bCs/>
           <w:sz w:val="18"/>
           <w:szCs w:val="18"/>
-        </w:rPr>
-        <w:t xml:space="preserve"> {{TahunTanggal}} </w:t>
-      </w:r>
-      <w:r>
-        <w:rPr>
-          <w:b/>
-          <w:bCs/>
-          <w:sz w:val="18"/>
-          <w:szCs w:val="18"/>
-        </w:rPr>
-        <w:t>telah</w:t>
-      </w:r>
-      <w:r>
-        <w:rPr>
-          <w:b/>
-          <w:bCs/>
-          <w:sz w:val="18"/>
-          <w:szCs w:val="18"/>
-        </w:rPr>
-        <w:t xml:space="preserve"> </w:t>
-      </w:r>
-      <w:r>
-        <w:rPr>
-          <w:b/>
-          <w:bCs/>
-          <w:sz w:val="18"/>
-          <w:szCs w:val="18"/>
-        </w:rPr>
-        <w:t>diserahterimakan</w:t>
-      </w:r>
-      <w:r>
-        <w:rPr>
-          <w:b/>
-          <w:bCs/>
-          <w:sz w:val="18"/>
-          <w:szCs w:val="18"/>
-        </w:rPr>
-        <w:t xml:space="preserve"> </w:t>
-      </w:r>
-      <w:r>
-        <w:rPr>
-          <w:b/>
-          <w:bCs/>
-          <w:sz w:val="18"/>
-          <w:szCs w:val="18"/>
-        </w:rPr>
-        <w:t>perangkat</w:t>
-      </w:r>
-      <w:r>
-        <w:rPr>
-          <w:b/>
-          <w:bCs/>
-          <w:sz w:val="18"/>
-          <w:szCs w:val="18"/>
-        </w:rPr>
-        <w:t xml:space="preserve"> </w:t>
-      </w:r>
-      <w:r>
-        <w:rPr>
-          <w:b/>
-          <w:bCs/>
-          <w:sz w:val="18"/>
-          <w:szCs w:val="18"/>
-        </w:rPr>
-        <w:t>dengan</w:t>
-      </w:r>
-      <w:r>
-        <w:rPr>
-          <w:b/>
-          <w:bCs/>
-          <w:sz w:val="18"/>
-          <w:szCs w:val="18"/>
-        </w:rPr>
-        <w:t xml:space="preserve"> </w:t>
-      </w:r>
-      <w:r>
-        <w:rPr>
-          <w:b/>
-          <w:bCs/>
-          <w:sz w:val="18"/>
-          <w:szCs w:val="18"/>
-        </w:rPr>
-        <w:t>spesifikasi</w:t>
-      </w:r>
-      <w:r>
-        <w:rPr>
-          <w:b/>
-          <w:bCs/>
-          <w:sz w:val="18"/>
-          <w:szCs w:val="18"/>
-        </w:rPr>
-        <w:t xml:space="preserve"> </w:t>
-      </w:r>
-      <w:r>
-        <w:rPr>
-          <w:b/>
-          <w:bCs/>
-          <w:sz w:val="18"/>
-          <w:szCs w:val="18"/>
-        </w:rPr>
-        <w:t>serta</w:t>
-      </w:r>
-      <w:r>
-        <w:rPr>
-          <w:b/>
-          <w:bCs/>
-          <w:sz w:val="18"/>
-          <w:szCs w:val="18"/>
-        </w:rPr>
-        <w:t xml:space="preserve"> </w:t>
-      </w:r>
-      <w:r>
-        <w:rPr>
-          <w:b/>
-          <w:bCs/>
-          <w:sz w:val="18"/>
-          <w:szCs w:val="18"/>
-        </w:rPr>
-        <w:t>syarat-syarat</w:t>
-      </w:r>
-      <w:r>
-        <w:rPr>
-          <w:b/>
-          <w:bCs/>
-          <w:sz w:val="18"/>
-          <w:szCs w:val="18"/>
-        </w:rPr>
-        <w:t xml:space="preserve"> dan </w:t>
-      </w:r>
-      <w:r>
-        <w:rPr>
-          <w:b/>
-          <w:bCs/>
-          <w:sz w:val="18"/>
-          <w:szCs w:val="18"/>
-        </w:rPr>
-        <w:t>ketentuan</w:t>
-      </w:r>
-      <w:r>
-        <w:rPr>
-          <w:b/>
-          <w:bCs/>
-          <w:sz w:val="18"/>
-          <w:szCs w:val="18"/>
-        </w:rPr>
-        <w:t xml:space="preserve"> </w:t>
-      </w:r>
-      <w:r>
-        <w:rPr>
-          <w:b/>
-          <w:bCs/>
-          <w:sz w:val="18"/>
-          <w:szCs w:val="18"/>
-        </w:rPr>
-        <w:t>sebagai</w:t>
-      </w:r>
-      <w:r>
-        <w:rPr>
-          <w:b/>
-          <w:bCs/>
-          <w:sz w:val="18"/>
-          <w:szCs w:val="18"/>
-        </w:rPr>
-        <w:t xml:space="preserve"> </w:t>
-      </w:r>
-      <w:r>
-        <w:rPr>
-          <w:b/>
-          <w:bCs/>
-          <w:sz w:val="18"/>
-          <w:szCs w:val="18"/>
-        </w:rPr>
-        <w:t>berikut</w:t>
-      </w:r>
-      <w:r>
-        <w:rPr>
-          <w:b/>
-          <w:bCs/>
-          <w:sz w:val="18"/>
-          <w:szCs w:val="18"/>
-        </w:rPr>
-        <w:t>:</w:t>
+          <w:lang w:val="nb-NO"/>
+        </w:rPr>
+        <w:t xml:space="preserve"> {{TahunTanggal}} telah diserahterimakan perangkat dengan spesifikasi serta syarat-syarat dan ketentuan sebagai berikut:</w:t>
       </w:r>
     </w:p>
     <w:p>
@@ -1535,6 +1346,7 @@
         <w:rPr>
           <w:sz w:val="18"/>
           <w:szCs w:val="18"/>
+          <w:lang w:val="nb-NO"/>
         </w:rPr>
       </w:pPr>
     </w:p>
@@ -1663,7 +1475,6 @@
                   <w:pPr>
                     <w:pStyle w:val="ListParagraph"/>
                     <w:ind w:left="0"/>
-                    <w:jc w:val="center"/>
                     <w:rPr>
                       <w:b/>
                       <w:bCs/>
@@ -1830,7 +1641,6 @@
                   <w:pPr>
                     <w:pStyle w:val="ListParagraph"/>
                     <w:ind w:left="0"/>
-                    <w:jc w:val="center"/>
                     <w:rPr>
                       <w:b/>
                       <w:bCs/>
@@ -2007,6 +1817,7 @@
             <w:pPr>
               <w:pStyle w:val="ListParagraph"/>
               <w:ind w:left="0"/>
+              <w:jc w:val="center"/>
               <w:rPr>
                 <w:b/>
                 <w:bCs/>
@@ -2069,7 +1880,7 @@
                 <w:szCs w:val="18"/>
                 <w:lang w:val="nb-NO"/>
               </w:rPr>
-              <w:t>{{PerangkatNo}}.</w:t>
+              <w:t>1.</w:t>
             </w:r>
           </w:p>
         </w:tc>
@@ -2096,7 +1907,7 @@
                 <w:szCs w:val="18"/>
                 <w:lang w:val="nb-NO"/>
               </w:rPr>
-              <w:t>{{PerangkatJumlah}}</w:t>
+              <w:t>5</w:t>
             </w:r>
           </w:p>
         </w:tc>
@@ -2123,7 +1934,7 @@
                 <w:szCs w:val="18"/>
                 <w:lang w:val="nb-NO"/>
               </w:rPr>
-              <w:t>{{PerangkatTerbilang}}</w:t>
+              <w:t>Lima</w:t>
             </w:r>
           </w:p>
         </w:tc>
@@ -2150,7 +1961,7 @@
                 <w:szCs w:val="18"/>
                 <w:lang w:val="nb-NO"/>
               </w:rPr>
-              <w:t>{{PerangkatSatuan}}</w:t>
+              <w:t>Pcs</w:t>
             </w:r>
           </w:p>
         </w:tc>
@@ -2177,7 +1988,7 @@
                 <w:szCs w:val="18"/>
                 <w:lang w:val="nb-NO"/>
               </w:rPr>
-              <w:t>{{PerangkatSN}}</w:t>
+              <w:t>2601AP61HVE9</w:t>
             </w:r>
           </w:p>
         </w:tc>
@@ -2204,7 +2015,7 @@
                 <w:szCs w:val="18"/>
                 <w:lang w:val="nb-NO"/>
               </w:rPr>
-              <w:t>{{PerangkatKeterangan}}</w:t>
+              <w:t>Logitech Signature M650</w:t>
             </w:r>
           </w:p>
         </w:tc>
@@ -2446,6 +2257,17 @@
         </w:rPr>
         <w:t>:</w:t>
       </w:r>
+    </w:p>
+    <w:p>
+      <w:pPr>
+        <w:pStyle w:val="ListParagraph"/>
+        <w:spacing w:after="120" w:line="276" w:lineRule="auto"/>
+        <w:ind w:left="360"/>
+        <w:jc w:val="both"/>
+        <w:rPr>
+          <w:lang w:val="nb-NO"/>
+        </w:rPr>
+      </w:pPr>
     </w:p>
     <w:p>
       <w:pPr>
@@ -2921,7 +2743,14 @@
           <w:sz w:val="18"/>
           <w:szCs w:val="18"/>
         </w:rPr>
-        <w:t>{{FungsiPJ}}</w:t>
+        <w:t xml:space="preserve">{{FungsiPJ}}</w:t>
+      </w:r>
+      <w:r>
+        <w:rPr>
+          <w:sz w:val="18"/>
+          <w:szCs w:val="18"/>
+        </w:rPr>
+        <w:t/>
       </w:r>
     </w:p>
     <w:p>
@@ -2985,7 +2814,7 @@
                     </pic:cNvPicPr>
                   </pic:nvPicPr>
                   <pic:blipFill>
-                    <a:blip r:embed="rId7"/>
+                    <a:blip r:embed="rId6"/>
                     <a:srcRect/>
                     <a:stretch>
                       <a:fillRect/>

</xml_diff>